<commit_message>
Fill in course name and full team roster on report/deck title pages
Course: Generative AI. Team: Nonthapat T., Jeeraporn Y., Chaiphan N., Jirun T. Submission date still a placeholder.

Co-Authored-By: Claude Sonnet 5 <noreply@anthropic.com>
</commit_message>
<xml_diff>
--- a/report/Final_Project_Report.docx
+++ b/report/Final_Project_Report.docx
@@ -76,7 +76,7 @@
           <w:sz w:val="24"/>
           <w:szCs w:val="24"/>
         </w:rPr>
-        <w:t xml:space="preserve">Team: Nonthapat Tangjeerawong, [Teammate Name — please fill in]</w:t>
+        <w:t xml:space="preserve">Team: Nonthapat T., Jeeraporn Y., Chaiphan N., Jirun T.</w:t>
       </w:r>
     </w:p>
     <w:p>
@@ -89,7 +89,7 @@
           <w:sz w:val="24"/>
           <w:szCs w:val="24"/>
         </w:rPr>
-        <w:t xml:space="preserve">Course: [Course Name / Number — please fill in]</w:t>
+        <w:t xml:space="preserve">Course: Generative AI</w:t>
       </w:r>
     </w:p>
     <w:p>
@@ -117,7 +117,7 @@
         </w:rPr>
         <w:t xml:space="preserve">Repository: </w:t>
       </w:r>
-      <w:hyperlink w:history="1" r:id="rIdfubxoc6irzziqsohy0g2n">
+      <w:hyperlink w:history="1" r:id="rIdnfz6bzvyfw-aulz5csfzt">
         <w:r>
           <w:rPr>
             <w:color w:val="0C8599"/>
@@ -293,7 +293,7 @@
         </w:rPr>
         <w:t xml:space="preserve">Repository: </w:t>
       </w:r>
-      <w:hyperlink w:history="1" r:id="rIda-n8hesxqbje5na1-uqpk">
+      <w:hyperlink w:history="1" r:id="rIdhiq8-lpstgb68a7nwj0y3">
         <w:r>
           <w:rPr>
             <w:color w:val="0C8599"/>
@@ -777,7 +777,7 @@
       <w:r>
         <w:t xml:space="preserve">Repository: </w:t>
       </w:r>
-      <w:hyperlink w:history="1" r:id="rIdgpicunqlt8ripjy2rwepo">
+      <w:hyperlink w:history="1" r:id="rIdvj3rxbu4plqbd10-wa5ii">
         <w:r>
           <w:rPr>
             <w:color w:val="0C8599"/>

</xml_diff>

<commit_message>
Update token pricing: one-time all-spot 3D unlock, revised photo reward
3D walk access is now a one-time 89-token unlock covering every spot for the session, instead of a per-spot 131-token charge. Photo-review reward now requires a minimum of 3 photos (was 5) and pays 30 tokens back per spot (was a flat 35 once). Updated app logic, README, and the report/deck to match.

Co-Authored-By: Claude Sonnet 5 <noreply@anthropic.com>
</commit_message>
<xml_diff>
--- a/report/Final_Project_Report.docx
+++ b/report/Final_Project_Report.docx
@@ -117,7 +117,7 @@
         </w:rPr>
         <w:t xml:space="preserve">Repository: </w:t>
       </w:r>
-      <w:hyperlink w:history="1" r:id="rIdnfz6bzvyfw-aulz5csfzt">
+      <w:hyperlink w:history="1" r:id="rIdndmz0ctou2umftnwqb-2m">
         <w:r>
           <w:rPr>
             <w:color w:val="0C8599"/>
@@ -293,7 +293,7 @@
         </w:rPr>
         <w:t xml:space="preserve">Repository: </w:t>
       </w:r>
-      <w:hyperlink w:history="1" r:id="rIdhiq8-lpstgb68a7nwj0y3">
+      <w:hyperlink w:history="1" r:id="rIdi0l5iy5youbcrzbevielu">
         <w:r>
           <w:rPr>
             <w:color w:val="0C8599"/>
@@ -316,7 +316,7 @@
         <w:spacing w:after="150"/>
       </w:pPr>
       <w:r>
-        <w:t xml:space="preserve">CNR’s pitched business model is a simulated token economy — $0.80 for 100 tokens, $4.00 for 600 tokens, 69 tokens to generate a plan, 131 tokens to walk a spot in 3D, and a 35-token refund for travelers who share five of their own reference photos plus a review. Per the project’s scope for this submission, the token economy is presentation only: it is fully implemented as local, in-memory application state so the demo feels like the real product, but no real payment processing, accounts, or persistence exist (see Section 3.4 and Appendix C for the full pricing model and margin analysis).</w:t>
+        <w:t xml:space="preserve">CNR’s pitched business model is a simulated token economy — $0.80 for 100 tokens, $4.00 for 600 tokens, 69 tokens to generate a plan, and a one-time 89-token payment to unlock 3D walking for every spot for the rest of the session. Travelers who share five of their own reference photos plus a review. Per the project’s scope for this submission, the token economy is presentation only: it is fully implemented as local, in-memory application state so the demo feels like the real product, but no real payment processing, accounts, or persistence exist (see Section 3.4 and Appendix C for the full pricing model and margin analysis).</w:t>
       </w:r>
     </w:p>
     <w:p>
@@ -389,7 +389,7 @@
         <w:spacing w:after="150"/>
       </w:pPr>
       <w:r>
-        <w:t xml:space="preserve">User journey: choose a destination (locked to Nice, France in this demo) → describe your interests in free text → CNR spends 69 tokens to generate a ranked plan with a plain-language explanation → fine-tune the plan live with budget/time/category sliders, which re-rank instantly at no extra token cost → spend 131 tokens to walk the chosen spot in an interactive first-person 3D scene → optionally share five photos and a review of that spot for a 35-token refund. Inputs: a free-text interest description and, optionally, slider adjustments. Outputs: a ranked list of curated Nice locations with a numeric score, a per-factor breakdown (preference match, cost fit, time fit), a natural-language explanation, and a walkable 3D scene for any spot.</w:t>
+        <w:t xml:space="preserve">User journey: choose a destination (locked to Nice, France in this demo) → describe your interests in free text → CNR spends 69 tokens to generate a ranked plan with a plain-language explanation → fine-tune the plan live with budget/time/category sliders, which re-rank instantly at no extra token cost → spend 89 tokens to walk the chosen spot in an interactive first-person 3D scene → optionally share five photos and 3 photos plus a review of any spot for a 30-token refund, repeatable per spot. Inputs: a free-text interest description and, optionally, slider adjustments. Outputs: a ranked list of curated Nice locations with a numeric score, a per-factor breakdown (preference match, cost fit, time fit), a natural-language explanation, and a walkable 3D scene for any spot.</w:t>
       </w:r>
     </w:p>
     <w:p>
@@ -777,7 +777,7 @@
       <w:r>
         <w:t xml:space="preserve">Repository: </w:t>
       </w:r>
-      <w:hyperlink w:history="1" r:id="rIdvj3rxbu4plqbd10-wa5ii">
+      <w:hyperlink w:history="1" r:id="rIdvtssan0zrcvpmxlg6zrlq">
         <w:r>
           <w:rPr>
             <w:color w:val="0C8599"/>
@@ -1040,7 +1040,7 @@
           <w:sz w:val="18"/>
           <w:szCs w:val="18"/>
         </w:rPr>
-        <w:t xml:space="preserve">Figure 4. The 3D walk scene generated for Cours Saleya Market — market stalls, warm ochre building facades, and cobblestone ground, with the "share 5 photos + a review" token-reward prompt visible top-right.</w:t>
+        <w:t xml:space="preserve">Figure 4. The 3D walk scene generated for Cours Saleya Market — market stalls, warm ochre building facades, and cobblestone ground, with the "share 3 photos + a review" token-reward prompt visible top-right.</w:t>
       </w:r>
     </w:p>
     <w:p>
@@ -1198,7 +1198,7 @@
         <w:spacing w:after="150"/>
       </w:pPr>
       <w:r>
-        <w:t xml:space="preserve">CNR’s pitched pricing (Appendix C) is $0.80 for 100 tokens or $4.00 for 600 tokens (a ~17% bulk discount), with a plan search costing 69 tokens (≈$0.46-0.55) and a 3D walk costing 131 tokens (≈$0.87-1.05). The application performs at most two LLM calls per paid action — one preference-parsing call per search (a few hundred tokens of API usage) and one ambiance-extraction call per spot walked (a few hundred tokens, dominated by the four curated reviews included in the prompt) — plus any number of free, local re-ranks through the plan editor. No image generation or text-to-speech calls occur in this application. We do not have a published per-token price for the course-provided gpt-5.6-luna model, but given the small prompt/completion sizes involved, the marginal API cost per paid action is on the order of a fraction of a U.S. cent for comparable small/mid-tier chat models. That implies a very large gross margin at the pitched price points — the 69-token search alone prices roughly two orders of magnitude above our estimated marginal API cost, which is the kind of markup a consumer app needs to also fund hosting, support, and the token-refund loop, though we have not modeled full unit economics (customer acquisition cost, refund rate, churn) here. Hosting cost is effectively zero today, since the app is a fully static, client-side bundle deployable to any static host (e.g. GitHub Pages, Vercel, Netlify) — that changes once real payment processing requires a server (Section 4.2).</w:t>
+        <w:t xml:space="preserve">CNR’s pitched pricing (Appendix C) is $0.80 for 100 tokens or $4.00 for 600 tokens (a ~17% bulk discount), with a plan search costing 69 tokens (≈$0.46-0.55) and a one-time 89-token payment (≈$0.60-0.71) unlocking 3D walking for every spot for the rest of the session. The application performs at most two LLM calls per paid action — one preference-parsing call per search (a few hundred tokens of API usage) and one ambiance-extraction call per spot walked (a few hundred tokens, dominated by the four curated reviews included in the prompt) — plus any number of free, local re-ranks through the plan editor. No image generation or text-to-speech calls occur in this application. We do not have a published per-token price for the course-provided gpt-5.6-luna model, but given the small prompt/completion sizes involved, the marginal API cost per paid action is on the order of a fraction of a U.S. cent for comparable small/mid-tier chat models. That implies a very large gross margin at the pitched price points — the 69-token search alone prices roughly two orders of magnitude above our estimated marginal API cost, which is the kind of markup a consumer app needs to also fund hosting, support, and the token-refund loop, though we have not modeled full unit economics (customer acquisition cost, refund rate, churn) here. Hosting cost is effectively zero today, since the app is a fully static, client-side bundle deployable to any static host (e.g. GitHub Pages, Vercel, Netlify) — that changes once real payment processing requires a server (Section 4.2).</w:t>
       </w:r>
     </w:p>
     <w:p>
@@ -1340,7 +1340,7 @@
         <w:spacing w:after="150"/>
       </w:pPr>
       <w:r>
-        <w:t xml:space="preserve">The most concrete near-term extension is one we scoped down for this submission on purpose: letting travelers upload their own reference photos per spot (up to five, as reflected in the UI’s reward prompt), using a vision-capable model call to extract richer, more accurate ambiance details directly from those photos instead of review text alone, and genuinely crediting the 35-token reward rather than simulating it. This is fully legitimate from a copyright standpoint (user-submitted content, not scraped), and would let the 3D scenes for a location improve incrementally as more travelers contribute photos. We deliberately did not attempt the full version of this for the current submission — it requires user accounts, photo storage, and moderation, which is a real backend product, not a few-day extension. As of this writing the vision-input code path is also blocked by an API-key permission scope issue on the course-provided key (confirmed via direct testing: text-only calls succeed, image-containing calls return a missing_scope error) — a credential/permissions issue, not a design limitation.</w:t>
+        <w:t xml:space="preserve">The most concrete near-term extension is one we scoped down for this submission on purpose: letting travelers upload their own reference photos per spot (up to five, as reflected in the UI’s reward prompt), using a vision-capable model call to extract richer, more accurate ambiance details directly from those photos instead of review text alone, and genuinely crediting the 30-token-per-spot reward rather than simulating it. This is fully legitimate from a copyright standpoint (user-submitted content, not scraped), and would let the 3D scenes for a location improve incrementally as more travelers contribute photos. We deliberately did not attempt the full version of this for the current submission — it requires user accounts, photo storage, and moderation, which is a real backend product, not a few-day extension. As of this writing the vision-input code path is also blocked by an API-key permission scope issue on the course-provided key (confirmed via direct testing: text-only calls succeed, image-containing calls return a missing_scope error) — a credential/permissions issue, not a design limitation.</w:t>
       </w:r>
     </w:p>
     <w:p>
@@ -2825,7 +2825,7 @@
                 <w:sz w:val="20"/>
                 <w:szCs w:val="20"/>
               </w:rPr>
-              <w:t xml:space="preserve">131 tokens</w:t>
+              <w:t xml:space="preserve">89 tokens (one-time, unlocks all spots)</w:t>
             </w:r>
           </w:p>
         </w:tc>
@@ -2847,7 +2847,7 @@
                 <w:sz w:val="20"/>
                 <w:szCs w:val="20"/>
               </w:rPr>
-              <w:t xml:space="preserve">≈ $0.87-1.05 depending on bundle</w:t>
+              <w:t xml:space="preserve">≈ $0.60-0.71, once per session</w:t>
             </w:r>
           </w:p>
         </w:tc>
@@ -2871,7 +2871,7 @@
                 <w:sz w:val="20"/>
                 <w:szCs w:val="20"/>
               </w:rPr>
-              <w:t xml:space="preserve">Share 5 photos + a review</w:t>
+              <w:t xml:space="preserve">Share 3 photos + a review, per spot</w:t>
             </w:r>
           </w:p>
         </w:tc>
@@ -2893,7 +2893,7 @@
                 <w:sz w:val="20"/>
                 <w:szCs w:val="20"/>
               </w:rPr>
-              <w:t xml:space="preserve">+35 tokens (refund)</w:t>
+              <w:t xml:space="preserve">+30 tokens (refund, repeatable per spot)</w:t>
             </w:r>
           </w:p>
         </w:tc>

</xml_diff>

<commit_message>
Add a tool-calling concierge agent (Lane 3)
New chat panel on the results screen backed by a genuine tool-calling agent, not another bounded extraction call like Lanes 1-2. It can call four tools - adjust_plan, get_spot_details, unlock_and_walk, download_report - each a thin wrapper around a function the app already trusted, so the model can act but never do anything the UI couldn't already do. Loop capped at 4 tool-call rounds. Confirmed gpt-5.6-luna supports real function-calling with reasoning_effort: none before building the UI around it. Updated the architecture diagram (now three lanes), report, and deck to match, including a real caught-and-fixed bug (duplicate assistant reply) documented in Results and Analysis.

Co-Authored-By: Claude Sonnet 5 <noreply@anthropic.com>
</commit_message>
<xml_diff>
--- a/report/Final_Project_Report.docx
+++ b/report/Final_Project_Report.docx
@@ -117,7 +117,7 @@
         </w:rPr>
         <w:t xml:space="preserve">Repository: </w:t>
       </w:r>
-      <w:hyperlink w:history="1" r:id="rIdndmz0ctou2umftnwqb-2m">
+      <w:hyperlink w:history="1" r:id="rIdzpezdf70qfmohlu4eo5yq">
         <w:r>
           <w:rPr>
             <w:color w:val="0C8599"/>
@@ -195,7 +195,7 @@
         <w:t xml:space="preserve">3. Results and Analysis</w:t>
       </w:r>
       <w:r>
-        <w:t xml:space="preserve">	8</w:t>
+        <w:t xml:space="preserve">	9</w:t>
       </w:r>
     </w:p>
     <w:p>
@@ -209,7 +209,7 @@
         <w:t xml:space="preserve">4. Conclusion</w:t>
       </w:r>
       <w:r>
-        <w:t xml:space="preserve">	12</w:t>
+        <w:t xml:space="preserve">	14</w:t>
       </w:r>
     </w:p>
     <w:p>
@@ -223,7 +223,7 @@
         <w:t xml:space="preserve">References</w:t>
       </w:r>
       <w:r>
-        <w:t xml:space="preserve">	13</w:t>
+        <w:t xml:space="preserve">	15</w:t>
       </w:r>
     </w:p>
     <w:p>
@@ -237,7 +237,7 @@
         <w:t xml:space="preserve">Appendix A: Curated Demo Dataset</w:t>
       </w:r>
       <w:r>
-        <w:t xml:space="preserve">	14</w:t>
+        <w:t xml:space="preserve">	16</w:t>
       </w:r>
     </w:p>
     <w:p>
@@ -251,7 +251,7 @@
         <w:t xml:space="preserve">Appendix B: Repository Structure</w:t>
       </w:r>
       <w:r>
-        <w:t xml:space="preserve">	15</w:t>
+        <w:t xml:space="preserve">	17</w:t>
       </w:r>
     </w:p>
     <w:p>
@@ -265,7 +265,7 @@
         <w:t xml:space="preserve">Appendix C: Simulated Token Pricing</w:t>
       </w:r>
       <w:r>
-        <w:t xml:space="preserve">	16</w:t>
+        <w:t xml:space="preserve">	18</w:t>
       </w:r>
     </w:p>
     <w:p>
@@ -293,7 +293,7 @@
         </w:rPr>
         <w:t xml:space="preserve">Repository: </w:t>
       </w:r>
-      <w:hyperlink w:history="1" r:id="rIdi0l5iy5youbcrzbevielu">
+      <w:hyperlink w:history="1" r:id="rIdtuvsyv8ipaaksbea4ona1">
         <w:r>
           <w:rPr>
             <w:color w:val="0C8599"/>
@@ -406,33 +406,46 @@
         <w:spacing w:after="150"/>
       </w:pPr>
       <w:r>
-        <w:t xml:space="preserve">We use OpenAI’s gpt-5.6-luna model via the Chat Completions API in strict JSON-object response mode for two narrowly-scoped extraction tasks, and deliberately keep the LLM out of the parts of the system where correctness and reproducibility matter most:</w:t>
-      </w:r>
-    </w:p>
-    <w:p>
-      <w:pPr>
-        <w:pStyle w:val="ListParagraph"/>
-        <w:numPr>
-          <w:ilvl w:val="0"/>
-          <w:numId w:val="2"/>
-        </w:numPr>
-        <w:spacing w:after="80"/>
-      </w:pPr>
-      <w:r>
-        <w:t xml:space="preserve">Preferences → weights: the LLM converts free text into structured numeric weights (budget level, time budget, category weights for relax/adventure/culture/food). It does not do the ranking itself.</w:t>
-      </w:r>
-    </w:p>
-    <w:p>
-      <w:pPr>
-        <w:pStyle w:val="ListParagraph"/>
-        <w:numPr>
-          <w:ilvl w:val="0"/>
-          <w:numId w:val="2"/>
-        </w:numPr>
-        <w:spacing w:after="80"/>
-      </w:pPr>
-      <w:r>
-        <w:t xml:space="preserve">Reviews → ambiance: the LLM reads a spot’s curated visitor reviews and extracts a structured "ambiance" specification — ground type, sky mood, a three-color palette, and 3–6 props — chosen only from fixed enumerated catalogs. It does not emit raw 3D geometry or coordinates.</w:t>
+        <w:t xml:space="preserve">We use OpenAI’s gpt-5.6-luna model via the Chat Completions API for three distinct roles, and deliberately keep the LLM out of the parts of the system where correctness and reproducibility matter most:</w:t>
+      </w:r>
+    </w:p>
+    <w:p>
+      <w:pPr>
+        <w:pStyle w:val="ListParagraph"/>
+        <w:numPr>
+          <w:ilvl w:val="0"/>
+          <w:numId w:val="2"/>
+        </w:numPr>
+        <w:spacing w:after="80"/>
+      </w:pPr>
+      <w:r>
+        <w:t xml:space="preserve">Preferences → weights: the LLM converts free text into structured numeric weights (budget level, time budget, category weights for relax/adventure/culture/food), via strict JSON-object mode. It does not do the ranking itself.</w:t>
+      </w:r>
+    </w:p>
+    <w:p>
+      <w:pPr>
+        <w:pStyle w:val="ListParagraph"/>
+        <w:numPr>
+          <w:ilvl w:val="0"/>
+          <w:numId w:val="2"/>
+        </w:numPr>
+        <w:spacing w:after="80"/>
+      </w:pPr>
+      <w:r>
+        <w:t xml:space="preserve">Reviews → ambiance: the LLM reads a spot’s curated visitor reviews and extracts a structured "ambiance" specification — ground type, sky mood, a three-color palette, and 3–6 props — chosen only from fixed enumerated catalogs, also via JSON-object mode. It does not emit raw 3D geometry or coordinates.</w:t>
+      </w:r>
+    </w:p>
+    <w:p>
+      <w:pPr>
+        <w:pStyle w:val="ListParagraph"/>
+        <w:numPr>
+          <w:ilvl w:val="0"/>
+          <w:numId w:val="2"/>
+        </w:numPr>
+        <w:spacing w:after="80"/>
+      </w:pPr>
+      <w:r>
+        <w:t xml:space="preserve">Concierge agent: a chat-based tool-calling agent (Section 2.4) that can call four bounded tools to adjust the plan, look up spot details, unlock the 3D walk, or download the report. Unlike the first two roles, this one genuinely chooses and sequences actions - the bound is on what the tools can do, not on the model's autonomy within the conversation.</w:t>
       </w:r>
     </w:p>
     <w:p>
@@ -549,7 +562,7 @@
         <w:spacing w:after="150"/>
       </w:pPr>
       <w:r>
-        <w:t xml:space="preserve">The application is a single-page React app with two independent pipelines ("lanes"), shown in Figure 1, plus a deterministic live plan editor layered on top of Lane 1. Lane 1 (the decision engine) runs once per session: free-text preferences go through an LLM parsing step into structured weights, which a deterministic scoring function uses to rank the five curated spots; those same weights are then exposed as sliders (PlanEditor.jsx) that re-run the scoring function on every change, live and for free. Lane 2 (the review-driven 3D walk) runs whenever the traveler selects a spot to walk around: that spot’s curated reviews go through a second LLM call that extracts a structured ambiance specification, which a deterministic, seeded layout algorithm turns into prop placements for a React Three Fiber (Three.js) scene, explorable with a first-person WASD + mouse-look controller built on the browser’s Pointer Lock API.</w:t>
+        <w:t xml:space="preserve">The application is a single-page React app with three independent pipelines ("lanes"), shown in Figure 1, plus a deterministic live plan editor layered on top of Lane 1. Lane 1 (the decision engine) runs once per session: free-text preferences go through an LLM parsing step into structured weights, which a deterministic scoring function uses to rank the five curated spots; those same weights are then exposed as sliders (PlanEditor.jsx) that re-run the scoring function on every change, live and for free. Lane 2 (the review-driven 3D walk) runs whenever the traveler selects a spot to walk around: that spot’s curated reviews go through a second LLM call that extracts a structured ambiance specification, which a deterministic, seeded layout algorithm turns into prop placements for a React Three Fiber (Three.js) scene, explorable with a first-person WASD + mouse-look controller built on the browser’s Pointer Lock API. Lane 3 (the concierge agent) is available on demand from a chat panel on the results screen: it is a genuine tool-calling agent, described in full in Section 2.4.</w:t>
       </w:r>
     </w:p>
     <w:p>
@@ -560,7 +573,7 @@
       <w:r>
         <w:drawing>
           <wp:inline distT="0" distB="0" distL="0" distR="0">
-            <wp:extent cx="5524500" cy="2638425"/>
+            <wp:extent cx="5524500" cy="3228975"/>
             <wp:effectExtent t="0" r="0" b="0" l="0"/>
             <wp:docPr id="1" name="" descr="" title=""/>
             <wp:cNvGraphicFramePr>
@@ -585,7 +598,7 @@
                   <pic:spPr bwMode="auto">
                     <a:xfrm>
                       <a:off x="0" y="0"/>
-                      <a:ext cx="5524500" cy="2638425"/>
+                      <a:ext cx="5524500" cy="3228975"/>
                     </a:xfrm>
                     <a:prstGeom prst="rect">
                       <a:avLst/>
@@ -611,7 +624,7 @@
           <w:sz w:val="18"/>
           <w:szCs w:val="18"/>
         </w:rPr>
-        <w:t xml:space="preserve">Figure 1. System architecture — the two-lane pipeline (LLM steps in orange, deterministic code in green). The live plan editor reuses Lane 1’s scoreSpots() function directly, so it required no new LLM integration.</w:t>
+        <w:t xml:space="preserve">Figure 1. System architecture — the three-lane pipeline (LLM steps in orange, deterministic code in green). Lane 3, the concierge agent, is the project’s actual agentic-flow example: every tool it calls wraps a function Lanes 1-2 already use.</w:t>
       </w:r>
     </w:p>
     <w:p>
@@ -750,111 +763,103 @@
         <w:spacing w:after="100" w:before="300"/>
       </w:pPr>
       <w:r>
-        <w:t xml:space="preserve">2.4 Agentic flow</w:t>
-      </w:r>
-    </w:p>
-    <w:p>
-      <w:pPr>
-        <w:spacing w:after="150"/>
-      </w:pPr>
-      <w:r>
-        <w:t xml:space="preserve">This project does not use an autonomous multi-step agent with open-ended tool access. We deliberately chose a bounded, two-call pipeline per lane instead: each LLM call has one job, a fixed output schema, and no ability to call further tools or take further actions on its own. For a decision-support tool where a traveler needs to trust and verify the reasoning, we judged reproducibility and auditability to be more important than autonomy — the live plan editor is the clearest expression of that choice, since it lets travelers adjust the outcome themselves through ordinary math rather than by re-prompting an LLM. Figure 1 doubles as the agentic-flow diagram: each orange box is one LLM call with a fixed system prompt and JSON schema; each green box is ordinary application code.</w:t>
-      </w:r>
-    </w:p>
-    <w:p>
-      <w:pPr>
-        <w:pStyle w:val="Heading2"/>
-        <w:spacing w:after="100" w:before="300"/>
-      </w:pPr>
-      <w:r>
-        <w:t xml:space="preserve">2.5 Repository and how to run</w:t>
-      </w:r>
-    </w:p>
-    <w:p>
-      <w:pPr>
-        <w:spacing w:after="150"/>
-      </w:pPr>
-      <w:r>
-        <w:t xml:space="preserve">Repository: </w:t>
-      </w:r>
-      <w:hyperlink w:history="1" r:id="rIdvtssan0zrcvpmxlg6zrlq">
-        <w:r>
-          <w:rPr>
-            <w:color w:val="0C8599"/>
-            <w:u w:val="single"/>
-          </w:rPr>
-          <w:t xml:space="preserve">https://github.com/GongNT/travel-3d-simulator</w:t>
-        </w:r>
-      </w:hyperlink>
-    </w:p>
-    <w:p>
-      <w:pPr>
-        <w:pStyle w:val="ListParagraph"/>
-        <w:numPr>
-          <w:ilvl w:val="0"/>
-          <w:numId w:val="2"/>
-        </w:numPr>
-        <w:spacing w:after="80"/>
-      </w:pPr>
-      <w:r>
-        <w:t xml:space="preserve">npm install</w:t>
-      </w:r>
-    </w:p>
-    <w:p>
-      <w:pPr>
-        <w:pStyle w:val="ListParagraph"/>
-        <w:numPr>
-          <w:ilvl w:val="0"/>
-          <w:numId w:val="2"/>
-        </w:numPr>
-        <w:spacing w:after="80"/>
-      </w:pPr>
-      <w:r>
-        <w:t xml:space="preserve">cp .env.example .env, then set VITE_OPENAI_API_KEY=sk-... in .env</w:t>
-      </w:r>
-    </w:p>
-    <w:p>
-      <w:pPr>
-        <w:pStyle w:val="ListParagraph"/>
-        <w:numPr>
-          <w:ilvl w:val="0"/>
-          <w:numId w:val="2"/>
-        </w:numPr>
-        <w:spacing w:after="80"/>
-      </w:pPr>
-      <w:r>
-        <w:t xml:space="preserve">npm run dev, then open the printed local URL (usually http://localhost:5173)</w:t>
-      </w:r>
-    </w:p>
-    <w:p>
-      <w:r>
-        <w:br w:type="page"/>
-      </w:r>
-    </w:p>
-    <w:p>
-      <w:pPr>
-        <w:pStyle w:val="Heading1"/>
-        <w:spacing w:after="150" w:before="400"/>
-      </w:pPr>
-      <w:r>
-        <w:t xml:space="preserve">3. Results and Analysis</w:t>
-      </w:r>
-    </w:p>
-    <w:p>
-      <w:pPr>
-        <w:pStyle w:val="Heading2"/>
-        <w:spacing w:after="100" w:before="300"/>
-      </w:pPr>
-      <w:r>
-        <w:t xml:space="preserve">3.1 Evidence</w:t>
-      </w:r>
-    </w:p>
-    <w:p>
-      <w:pPr>
-        <w:spacing w:after="150"/>
-      </w:pPr>
-      <w:r>
-        <w:t xml:space="preserve">Figures 2–4 show the application end-to-end, captured directly from a running instance.</w:t>
+        <w:t xml:space="preserve">2.4 Agentic flow: the concierge agent</w:t>
+      </w:r>
+    </w:p>
+    <w:p>
+      <w:pPr>
+        <w:spacing w:after="150"/>
+      </w:pPr>
+      <w:r>
+        <w:t xml:space="preserve">Lanes 1 and 2 are deliberately bounded, non-agentic LLM calls — one job, one fixed JSON schema, no ability to take further action. Lane 3, the concierge chat, is a genuine tool-calling agent: a traveler sends a free-text message, and the model can choose to call one or more of four tools before replying, in a loop (src/lib/conciergeAgent.js, runConciergeTurn()) capped at four rounds so a confused model cannot loop indefinitely.</w:t>
+      </w:r>
+    </w:p>
+    <w:p>
+      <w:pPr>
+        <w:pStyle w:val="ListParagraph"/>
+        <w:numPr>
+          <w:ilvl w:val="0"/>
+          <w:numId w:val="2"/>
+        </w:numPr>
+        <w:spacing w:after="80"/>
+      </w:pPr>
+      <w:r>
+        <w:rPr>
+          <w:b/>
+          <w:bCs/>
+        </w:rPr>
+        <w:t xml:space="preserve">adjust_plan — </w:t>
+      </w:r>
+      <w:r>
+        <w:t xml:space="preserve">merges partial weight changes ("cheaper", "more adventurous") into the current preferences and re-ranks via the same scoreSpots() Lane 1 uses.</w:t>
+      </w:r>
+    </w:p>
+    <w:p>
+      <w:pPr>
+        <w:pStyle w:val="ListParagraph"/>
+        <w:numPr>
+          <w:ilvl w:val="0"/>
+          <w:numId w:val="2"/>
+        </w:numPr>
+        <w:spacing w:after="80"/>
+      </w:pPr>
+      <w:r>
+        <w:rPr>
+          <w:b/>
+          <w:bCs/>
+        </w:rPr>
+        <w:t xml:space="preserve">get_spot_details — </w:t>
+      </w:r>
+      <w:r>
+        <w:t xml:space="preserve">returns a spot's tagline, cost, duration, travel time, and full curated reviews, so the model answers questions (e.g. "is it crowded?") grounded only in that data, not general knowledge.</w:t>
+      </w:r>
+    </w:p>
+    <w:p>
+      <w:pPr>
+        <w:pStyle w:val="ListParagraph"/>
+        <w:numPr>
+          <w:ilvl w:val="0"/>
+          <w:numId w:val="2"/>
+        </w:numPr>
+        <w:spacing w:after="80"/>
+      </w:pPr>
+      <w:r>
+        <w:rPr>
+          <w:b/>
+          <w:bCs/>
+        </w:rPr>
+        <w:t xml:space="preserve">unlock_and_walk — </w:t>
+      </w:r>
+      <w:r>
+        <w:t xml:space="preserve">resolves a fuzzy spot name ("the market") to a real spot, checks token balance before acting, and calls the same onEnter() handler the "Walk around X" button uses.</w:t>
+      </w:r>
+    </w:p>
+    <w:p>
+      <w:pPr>
+        <w:pStyle w:val="ListParagraph"/>
+        <w:numPr>
+          <w:ilvl w:val="0"/>
+          <w:numId w:val="2"/>
+        </w:numPr>
+        <w:spacing w:after="80"/>
+      </w:pPr>
+      <w:r>
+        <w:rPr>
+          <w:b/>
+          <w:bCs/>
+        </w:rPr>
+        <w:t xml:space="preserve">download_report — </w:t>
+      </w:r>
+      <w:r>
+        <w:t xml:space="preserve">calls the existing generatePlanReport()/downloadPlanReport() pair from Section 2.2.</w:t>
+      </w:r>
+    </w:p>
+    <w:p>
+      <w:pPr>
+        <w:spacing w:after="150"/>
+      </w:pPr>
+      <w:r>
+        <w:t xml:space="preserve">The design constraint that makes this safe to demo: every tool is a thin wrapper around a function the app already trusted before the agent existed. The model cannot execute arbitrary code, reach the network itself, or do anything a button in the UI couldn't already do — it only decides which existing action to take and with what arguments. Real-world tool calling on gpt-5.6-luna required the same fix noted in Section 2.3 (reasoning_effort: "none"); we confirmed this directly against the API (a raw request with tools attached and reasoning_effort: "none" correctly returned a tool_calls response) before building the UI around it.</w:t>
       </w:r>
     </w:p>
     <w:p>
@@ -865,7 +870,7 @@
       <w:r>
         <w:drawing>
           <wp:inline distT="0" distB="0" distL="0" distR="0">
-            <wp:extent cx="5334000" cy="3752850"/>
+            <wp:extent cx="5334000" cy="1581150"/>
             <wp:effectExtent t="0" r="0" b="0" l="0"/>
             <wp:docPr id="1" name="" descr="" title=""/>
             <wp:cNvGraphicFramePr>
@@ -890,7 +895,7 @@
                   <pic:spPr bwMode="auto">
                     <a:xfrm>
                       <a:off x="0" y="0"/>
-                      <a:ext cx="5334000" cy="3752850"/>
+                      <a:ext cx="5334000" cy="1581150"/>
                     </a:xfrm>
                     <a:prstGeom prst="rect">
                       <a:avLst/>
@@ -916,7 +921,103 @@
           <w:sz w:val="18"/>
           <w:szCs w:val="18"/>
         </w:rPr>
-        <w:t xml:space="preserve">Figure 2. The destination step — locked to Nice, France for this demo, with an honest note that more destinations are a roadmap item.</w:t>
+        <w:t xml:space="preserve">Figure 2. The concierge agent answering a question via get_spot_details() - the reply is grounded entirely in Castle Hill's curated reviews, not invented.</w:t>
+      </w:r>
+    </w:p>
+    <w:p>
+      <w:pPr>
+        <w:pStyle w:val="Heading2"/>
+        <w:spacing w:after="100" w:before="300"/>
+      </w:pPr>
+      <w:r>
+        <w:t xml:space="preserve">2.5 Repository and how to run</w:t>
+      </w:r>
+    </w:p>
+    <w:p>
+      <w:pPr>
+        <w:spacing w:after="150"/>
+      </w:pPr>
+      <w:r>
+        <w:t xml:space="preserve">Repository: </w:t>
+      </w:r>
+      <w:hyperlink w:history="1" r:id="rIdku72bzsammmnxw6dgfo8s">
+        <w:r>
+          <w:rPr>
+            <w:color w:val="0C8599"/>
+            <w:u w:val="single"/>
+          </w:rPr>
+          <w:t xml:space="preserve">https://github.com/GongNT/travel-3d-simulator</w:t>
+        </w:r>
+      </w:hyperlink>
+    </w:p>
+    <w:p>
+      <w:pPr>
+        <w:pStyle w:val="ListParagraph"/>
+        <w:numPr>
+          <w:ilvl w:val="0"/>
+          <w:numId w:val="2"/>
+        </w:numPr>
+        <w:spacing w:after="80"/>
+      </w:pPr>
+      <w:r>
+        <w:t xml:space="preserve">npm install</w:t>
+      </w:r>
+    </w:p>
+    <w:p>
+      <w:pPr>
+        <w:pStyle w:val="ListParagraph"/>
+        <w:numPr>
+          <w:ilvl w:val="0"/>
+          <w:numId w:val="2"/>
+        </w:numPr>
+        <w:spacing w:after="80"/>
+      </w:pPr>
+      <w:r>
+        <w:t xml:space="preserve">cp .env.example .env, then set VITE_OPENAI_API_KEY=sk-... in .env</w:t>
+      </w:r>
+    </w:p>
+    <w:p>
+      <w:pPr>
+        <w:pStyle w:val="ListParagraph"/>
+        <w:numPr>
+          <w:ilvl w:val="0"/>
+          <w:numId w:val="2"/>
+        </w:numPr>
+        <w:spacing w:after="80"/>
+      </w:pPr>
+      <w:r>
+        <w:t xml:space="preserve">npm run dev, then open the printed local URL (usually http://localhost:5173)</w:t>
+      </w:r>
+    </w:p>
+    <w:p>
+      <w:r>
+        <w:br w:type="page"/>
+      </w:r>
+    </w:p>
+    <w:p>
+      <w:pPr>
+        <w:pStyle w:val="Heading1"/>
+        <w:spacing w:after="150" w:before="400"/>
+      </w:pPr>
+      <w:r>
+        <w:t xml:space="preserve">3. Results and Analysis</w:t>
+      </w:r>
+    </w:p>
+    <w:p>
+      <w:pPr>
+        <w:pStyle w:val="Heading2"/>
+        <w:spacing w:after="100" w:before="300"/>
+      </w:pPr>
+      <w:r>
+        <w:t xml:space="preserve">3.1 Evidence</w:t>
+      </w:r>
+    </w:p>
+    <w:p>
+      <w:pPr>
+        <w:spacing w:after="150"/>
+      </w:pPr>
+      <w:r>
+        <w:t xml:space="preserve">Figures 3–5 show the application end-to-end, captured directly from a running instance.</w:t>
       </w:r>
     </w:p>
     <w:p>
@@ -927,7 +1028,7 @@
       <w:r>
         <w:drawing>
           <wp:inline distT="0" distB="0" distL="0" distR="0">
-            <wp:extent cx="5334000" cy="7391400"/>
+            <wp:extent cx="5334000" cy="3752850"/>
             <wp:effectExtent t="0" r="0" b="0" l="0"/>
             <wp:docPr id="1" name="" descr="" title=""/>
             <wp:cNvGraphicFramePr>
@@ -952,7 +1053,7 @@
                   <pic:spPr bwMode="auto">
                     <a:xfrm>
                       <a:off x="0" y="0"/>
-                      <a:ext cx="5334000" cy="7391400"/>
+                      <a:ext cx="5334000" cy="3752850"/>
                     </a:xfrm>
                     <a:prstGeom prst="rect">
                       <a:avLst/>
@@ -978,7 +1079,7 @@
           <w:sz w:val="18"/>
           <w:szCs w:val="18"/>
         </w:rPr>
-        <w:t xml:space="preserve">Figure 3. The live plan editor and ranked results: sliders for budget, time, and each category re-rank the five curated spots instantly, at no extra token cost. Cours Saleya Market scores highest (0.94) for this traveler.</w:t>
+        <w:t xml:space="preserve">Figure 3. The destination step — locked to Nice, France for this demo, with an honest note that more destinations are a roadmap item.</w:t>
       </w:r>
     </w:p>
     <w:p>
@@ -989,7 +1090,7 @@
       <w:r>
         <w:drawing>
           <wp:inline distT="0" distB="0" distL="0" distR="0">
-            <wp:extent cx="5334000" cy="3752850"/>
+            <wp:extent cx="5334000" cy="7391400"/>
             <wp:effectExtent t="0" r="0" b="0" l="0"/>
             <wp:docPr id="1" name="" descr="" title=""/>
             <wp:cNvGraphicFramePr>
@@ -1014,6 +1115,68 @@
                   <pic:spPr bwMode="auto">
                     <a:xfrm>
                       <a:off x="0" y="0"/>
+                      <a:ext cx="5334000" cy="7391400"/>
+                    </a:xfrm>
+                    <a:prstGeom prst="rect">
+                      <a:avLst/>
+                    </a:prstGeom>
+                  </pic:spPr>
+                </pic:pic>
+              </a:graphicData>
+            </a:graphic>
+          </wp:inline>
+        </w:drawing>
+      </w:r>
+    </w:p>
+    <w:p>
+      <w:pPr>
+        <w:spacing w:after="200"/>
+        <w:jc w:val="center"/>
+      </w:pPr>
+      <w:r>
+        <w:rPr>
+          <w:i/>
+          <w:iCs/>
+          <w:color w:val="555555"/>
+          <w:sz w:val="18"/>
+          <w:szCs w:val="18"/>
+        </w:rPr>
+        <w:t xml:space="preserve">Figure 4. The live plan editor and ranked results: sliders for budget, time, and each category re-rank the five curated spots instantly, at no extra token cost. Cours Saleya Market scores highest (0.94) for this traveler.</w:t>
+      </w:r>
+    </w:p>
+    <w:p>
+      <w:pPr>
+        <w:spacing w:before="200"/>
+        <w:jc w:val="center"/>
+      </w:pPr>
+      <w:r>
+        <w:drawing>
+          <wp:inline distT="0" distB="0" distL="0" distR="0">
+            <wp:extent cx="5334000" cy="3752850"/>
+            <wp:effectExtent t="0" r="0" b="0" l="0"/>
+            <wp:docPr id="1" name="" descr="" title=""/>
+            <wp:cNvGraphicFramePr>
+              <a:graphicFrameLocks xmlns:a="http://schemas.openxmlformats.org/drawingml/2006/main" noChangeAspect="1"/>
+            </wp:cNvGraphicFramePr>
+            <a:graphic xmlns:a="http://schemas.openxmlformats.org/drawingml/2006/main">
+              <a:graphicData uri="http://schemas.openxmlformats.org/drawingml/2006/picture">
+                <pic:pic xmlns:pic="http://schemas.openxmlformats.org/drawingml/2006/picture">
+                  <pic:nvPicPr>
+                    <pic:cNvPr id="0" name="" descr=""/>
+                    <pic:cNvPicPr>
+                      <a:picLocks noChangeAspect="1" noChangeArrowheads="1"/>
+                    </pic:cNvPicPr>
+                  </pic:nvPicPr>
+                  <pic:blipFill>
+                    <a:blip r:embed="rId11" cstate="none"/>
+                    <a:srcRect/>
+                    <a:stretch>
+                      <a:fillRect/>
+                    </a:stretch>
+                  </pic:blipFill>
+                  <pic:spPr bwMode="auto">
+                    <a:xfrm>
+                      <a:off x="0" y="0"/>
                       <a:ext cx="5334000" cy="3752850"/>
                     </a:xfrm>
                     <a:prstGeom prst="rect">
@@ -1040,7 +1203,7 @@
           <w:sz w:val="18"/>
           <w:szCs w:val="18"/>
         </w:rPr>
-        <w:t xml:space="preserve">Figure 4. The 3D walk scene generated for Cours Saleya Market — market stalls, warm ochre building facades, and cobblestone ground, with the "share 3 photos + a review" token-reward prompt visible top-right.</w:t>
+        <w:t xml:space="preserve">Figure 5. The 3D walk scene generated for Cours Saleya Market — market stalls, warm ochre building facades, and cobblestone ground, with the "share 3 photos + a review" token-reward prompt visible top-right.</w:t>
       </w:r>
     </w:p>
     <w:p>
@@ -1118,6 +1281,19 @@
     </w:p>
     <w:p>
       <w:pPr>
+        <w:pStyle w:val="ListParagraph"/>
+        <w:numPr>
+          <w:ilvl w:val="0"/>
+          <w:numId w:val="2"/>
+        </w:numPr>
+        <w:spacing w:after="80"/>
+      </w:pPr>
+      <w:r>
+        <w:t xml:space="preserve">The concierge agent correctly selects and sequences tools across varied phrasing: "make it cheaper and more adventurous" triggered adjust_plan and visibly re-ranked the plan; "what's the best time to visit Castle Hill and is it crowded?" triggered get_spot_details and answered using only that spot's review text (Figure 2); "take me to walk around the market" resolved the fuzzy name to Cours Saleya Market via unlock_and_walk and opened the 3D scene.</w:t>
+      </w:r>
+    </w:p>
+    <w:p>
+      <w:pPr>
         <w:spacing w:after="150"/>
       </w:pPr>
       <w:r>
@@ -1169,6 +1345,19 @@
     </w:p>
     <w:p>
       <w:pPr>
+        <w:pStyle w:val="ListParagraph"/>
+        <w:numPr>
+          <w:ilvl w:val="0"/>
+          <w:numId w:val="2"/>
+        </w:numPr>
+        <w:spacing w:after="80"/>
+      </w:pPr>
+      <w:r>
+        <w:t xml:space="preserve">An early version of the concierge chat rendered the assistant's final reply twice per turn - the agent loop already appended the reply to its own message history before returning it, and the UI appended it again. Caught during verification and fixed by treating the returned message list as the single source of truth rather than re-adding to it.</w:t>
+      </w:r>
+    </w:p>
+    <w:p>
+      <w:pPr>
         <w:pStyle w:val="Heading2"/>
         <w:spacing w:after="100" w:before="300"/>
       </w:pPr>
@@ -1292,7 +1481,7 @@
         <w:spacing w:after="150"/>
       </w:pPr>
       <w:r>
-        <w:t xml:space="preserve">The scoring formula is score = 0.5 × categoryScore + 0.25 × costScore + 0.25 × timeScore + tagBonus, where categoryScore comes directly from the LLM-derived (or slider-adjusted) preference weights, costScore and timeScore are linear penalty functions against the spot’s cost level and duration, and tagBonus is a small additive nudge for secondary tag overlap (src/lib/scoring.js) — which is why a very strong match can push the displayed score slightly above 100. For the example in Figure 3 ("a relaxed five-hour trip with a mid-range budget and enjoyable food along the way"), Cours Saleya Market scored 0.94 — a strong preference match (0.80) combined with a perfect cost fit (1.00) and time fit (1.00) — narrowly ahead of Promenade des Anglais at 0.93. Because every factor is a plain arithmetic function over structured inputs, a user (or grader) can verify the ranking by hand from the numbers shown on screen, and can watch it update live by moving a slider — the explicit goal of treating the LLM as a translator into structured data, never as the decision-maker itself.</w:t>
+        <w:t xml:space="preserve">The scoring formula is score = 0.5 × categoryScore + 0.25 × costScore + 0.25 × timeScore + tagBonus, where categoryScore comes directly from the LLM-derived (or slider-adjusted) preference weights, costScore and timeScore are linear penalty functions against the spot’s cost level and duration, and tagBonus is a small additive nudge for secondary tag overlap (src/lib/scoring.js) — which is why a very strong match can push the displayed score slightly above 100. For the example in Figure 4 ("a relaxed five-hour trip with a mid-range budget and enjoyable food along the way"), Cours Saleya Market scored 0.94 — a strong preference match (0.80) combined with a perfect cost fit (1.00) and time fit (1.00) — narrowly ahead of Promenade des Anglais at 0.93. Because every factor is a plain arithmetic function over structured inputs, a user (or grader) can verify the ranking by hand from the numbers shown on screen, and can watch it update live by moving a slider — the explicit goal of treating the LLM as a translator into structured data, never as the decision-maker itself.</w:t>
       </w:r>
     </w:p>
     <w:p>
@@ -2306,7 +2495,20 @@
         <w:spacing w:after="80"/>
       </w:pPr>
       <w:r>
-        <w:t xml:space="preserve">src/lib/openai.js — thin fetch() wrapper around the Chat Completions API, JSON-object mode.</w:t>
+        <w:t xml:space="preserve">src/lib/openai.js — thin fetch() wrapper around the Chat Completions API, both JSON-object mode (chatJSON) and tool-calling mode (chatWithTools).</w:t>
+      </w:r>
+    </w:p>
+    <w:p>
+      <w:pPr>
+        <w:pStyle w:val="ListParagraph"/>
+        <w:numPr>
+          <w:ilvl w:val="0"/>
+          <w:numId w:val="2"/>
+        </w:numPr>
+        <w:spacing w:after="80"/>
+      </w:pPr>
+      <w:r>
+        <w:t xml:space="preserve">src/lib/conciergeAgent.js — the concierge agent's tool schemas, tool dispatch, and the bounded (max 4 rounds) tool-calling loop.</w:t>
       </w:r>
     </w:p>
     <w:p>
@@ -2450,6 +2652,19 @@
       </w:pPr>
       <w:r>
         <w:t xml:space="preserve">src/three/WalkController.jsx — first-person WASD + mouse-look controller (Pointer Lock API).</w:t>
+      </w:r>
+    </w:p>
+    <w:p>
+      <w:pPr>
+        <w:pStyle w:val="ListParagraph"/>
+        <w:numPr>
+          <w:ilvl w:val="0"/>
+          <w:numId w:val="2"/>
+        </w:numPr>
+        <w:spacing w:after="80"/>
+      </w:pPr>
+      <w:r>
+        <w:t xml:space="preserve">src/components/ConciergeChat.jsx — the concierge chat UI (message history, input, loading state).</w:t>
       </w:r>
     </w:p>
     <w:p>

</xml_diff>

<commit_message>
Reconcile report and deck with recaptured screenshots and fix overlaps
Recaptured screenshots after the token pricing update show Promenade des Anglais as the top-ranked example instead of Cours Saleya Market; updates every caption and prose reference in the report and deck to match. Also fixes several title/body text overlaps and stale content introduced when the deck was reformatted in Google Slides.
</commit_message>
<xml_diff>
--- a/report/Final_Project_Report.docx
+++ b/report/Final_Project_Report.docx
@@ -117,7 +117,7 @@
         </w:rPr>
         <w:t xml:space="preserve">Repository: </w:t>
       </w:r>
-      <w:hyperlink w:history="1" r:id="rIdzpezdf70qfmohlu4eo5yq">
+      <w:hyperlink w:history="1" r:id="rIdo0ezuyyzuphntwyqybj-r">
         <w:r>
           <w:rPr>
             <w:color w:val="0C8599"/>
@@ -293,7 +293,7 @@
         </w:rPr>
         <w:t xml:space="preserve">Repository: </w:t>
       </w:r>
-      <w:hyperlink w:history="1" r:id="rIdtuvsyv8ipaaksbea4ona1">
+      <w:hyperlink w:history="1" r:id="rId1sa9r9thjvr5qnn3zp_rq">
         <w:r>
           <w:rPr>
             <w:color w:val="0C8599"/>
@@ -940,7 +940,7 @@
       <w:r>
         <w:t xml:space="preserve">Repository: </w:t>
       </w:r>
-      <w:hyperlink w:history="1" r:id="rIdku72bzsammmnxw6dgfo8s">
+      <w:hyperlink w:history="1" r:id="rIda1hmdhctbxz5z9ob8pbqt">
         <w:r>
           <w:rPr>
             <w:color w:val="0C8599"/>
@@ -1141,7 +1141,7 @@
           <w:sz w:val="18"/>
           <w:szCs w:val="18"/>
         </w:rPr>
-        <w:t xml:space="preserve">Figure 4. The live plan editor and ranked results: sliders for budget, time, and each category re-rank the five curated spots instantly, at no extra token cost. Cours Saleya Market scores highest (0.94) for this traveler.</w:t>
+        <w:t xml:space="preserve">Figure 4. The live plan editor and ranked results: sliders for budget, time, and each category re-rank the five curated spots instantly, at no extra token cost. Promenade des Anglais scores highest (0.93) for this traveler, narrowly ahead of Port de Nice (0.93, lower time fit) and Cours Saleya Market (0.89).</w:t>
       </w:r>
     </w:p>
     <w:p>
@@ -1203,7 +1203,7 @@
           <w:sz w:val="18"/>
           <w:szCs w:val="18"/>
         </w:rPr>
-        <w:t xml:space="preserve">Figure 5. The 3D walk scene generated for Cours Saleya Market — market stalls, warm ochre building facades, and cobblestone ground, with the "share 3 photos + a review" token-reward prompt visible top-right.</w:t>
+        <w:t xml:space="preserve">Figure 5. The 3D walk scene generated for Promenade des Anglais — stylized low-poly seafront buildings on warm ochre and teal, with the "share 3 photos + a review" token-reward prompt visible top-right.</w:t>
       </w:r>
     </w:p>
     <w:p>
@@ -1289,7 +1289,7 @@
         <w:spacing w:after="80"/>
       </w:pPr>
       <w:r>
-        <w:t xml:space="preserve">The concierge agent correctly selects and sequences tools across varied phrasing: "make it cheaper and more adventurous" triggered adjust_plan and visibly re-ranked the plan; "what's the best time to visit Castle Hill and is it crowded?" triggered get_spot_details and answered using only that spot's review text (Figure 2); "take me to walk around the market" resolved the fuzzy name to Cours Saleya Market via unlock_and_walk and opened the 3D scene.</w:t>
+        <w:t xml:space="preserve">The concierge agent correctly selects and sequences tools across varied phrasing: "make it cheaper and more adventurous" triggered adjust_plan and visibly re-ranked the plan; "what's the best time to visit Castle Hill and is it crowded?" triggered get_spot_details and answered using only that spot's review text (Figure 2); "take me for a walk along the seafront" resolved the fuzzy phrasing to Promenade des Anglais via unlock_and_walk and opened the 3D scene.</w:t>
       </w:r>
     </w:p>
     <w:p>
@@ -1481,7 +1481,7 @@
         <w:spacing w:after="150"/>
       </w:pPr>
       <w:r>
-        <w:t xml:space="preserve">The scoring formula is score = 0.5 × categoryScore + 0.25 × costScore + 0.25 × timeScore + tagBonus, where categoryScore comes directly from the LLM-derived (or slider-adjusted) preference weights, costScore and timeScore are linear penalty functions against the spot’s cost level and duration, and tagBonus is a small additive nudge for secondary tag overlap (src/lib/scoring.js) — which is why a very strong match can push the displayed score slightly above 100. For the example in Figure 4 ("a relaxed five-hour trip with a mid-range budget and enjoyable food along the way"), Cours Saleya Market scored 0.94 — a strong preference match (0.80) combined with a perfect cost fit (1.00) and time fit (1.00) — narrowly ahead of Promenade des Anglais at 0.93. Because every factor is a plain arithmetic function over structured inputs, a user (or grader) can verify the ranking by hand from the numbers shown on screen, and can watch it update live by moving a slider — the explicit goal of treating the LLM as a translator into structured data, never as the decision-maker itself.</w:t>
+        <w:t xml:space="preserve">The scoring formula is score = 0.5 × categoryScore + 0.25 × costScore + 0.25 × timeScore + tagBonus, where categoryScore comes directly from the LLM-derived (or slider-adjusted) preference weights, costScore and timeScore are linear penalty functions against the spot’s cost level and duration, and tagBonus is a small additive nudge for secondary tag overlap (src/lib/scoring.js) — which is why a very strong match can push the displayed score slightly above 100. For the example in Figure 4 ("a relaxed five-hour trip with a mid-range budget and enjoyable food along the way"), Promenade des Anglais scored 0.93 — a strong preference match (0.80) combined with a perfect cost fit (1.00) and time fit (1.00) — narrowly ahead of Port de Nice, which tied on overall score (0.93) but scored lower on time fit. Because every factor is a plain arithmetic function over structured inputs, a user (or grader) can verify the ranking by hand from the numbers shown on screen, and can watch it update live by moving a slider — the explicit goal of treating the LLM as a translator into structured data, never as the decision-maker itself.</w:t>
       </w:r>
     </w:p>
     <w:p>

</xml_diff>